<commit_message>
Actualización de RegDin13 y 08
</commit_message>
<xml_diff>
--- a/WALLETS_MASTERCARD/REG-DIN-008 - 900241_Modificaciones en TokenizationAPI para Wallets MasterCard.docx
+++ b/WALLETS_MASTERCARD/REG-DIN-008 - 900241_Modificaciones en TokenizationAPI para Wallets MasterCard.docx
@@ -65,7 +65,7 @@
       </w:tblPr>
       <w:tblGrid>
         <w:gridCol w:w="3536"/>
-        <w:gridCol w:w="5944"/>
+        <w:gridCol w:w="5943"/>
       </w:tblGrid>
       <w:tr>
         <w:trPr>
@@ -97,7 +97,7 @@
                 <w:color w:val="000000"/>
                 <w:sz w:val="20"/>
               </w:rPr>
-              <w:t>FECHA:   1</w:t>
+              <w:t xml:space="preserve">FECHA:   </w:t>
             </w:r>
             <w:r>
               <w:rPr>
@@ -105,7 +105,7 @@
                 <w:color w:val="000000"/>
                 <w:sz w:val="20"/>
               </w:rPr>
-              <w:t>7</w:t>
+              <w:t>25</w:t>
             </w:r>
             <w:r>
               <w:rPr>
@@ -119,7 +119,7 @@
         </w:tc>
         <w:tc>
           <w:tcPr>
-            <w:tcW w:w="5944" w:type="dxa"/>
+            <w:tcW w:w="5943" w:type="dxa"/>
             <w:tcBorders>
               <w:top w:val="single" w:sz="4" w:space="0" w:color="000000"/>
               <w:left w:val="single" w:sz="4" w:space="0" w:color="000000"/>
@@ -299,7 +299,7 @@
         </w:tc>
         <w:tc>
           <w:tcPr>
-            <w:tcW w:w="5944" w:type="dxa"/>
+            <w:tcW w:w="5943" w:type="dxa"/>
             <w:tcBorders>
               <w:top w:val="single" w:sz="4" w:space="0" w:color="000000"/>
               <w:left w:val="single" w:sz="4" w:space="0" w:color="000000"/>
@@ -430,7 +430,7 @@
               <mc:AlternateContent>
                 <mc:Choice Requires="wps">
                   <w:drawing>
-                    <wp:anchor behindDoc="0" distT="5715" distB="5080" distL="5080" distR="5715" simplePos="0" locked="0" layoutInCell="1" allowOverlap="1" relativeHeight="6">
+                    <wp:anchor behindDoc="0" distT="5715" distB="5080" distL="5080" distR="5715" simplePos="0" locked="0" layoutInCell="1" allowOverlap="1" relativeHeight="4">
                       <wp:simplePos x="0" y="0"/>
                       <wp:positionH relativeFrom="column">
                         <wp:posOffset>3346450</wp:posOffset>
@@ -490,7 +490,7 @@
               <mc:AlternateContent>
                 <mc:Choice Requires="wps">
                   <w:drawing>
-                    <wp:anchor behindDoc="0" distT="5715" distB="5080" distL="5080" distR="5715" simplePos="0" locked="0" layoutInCell="1" allowOverlap="1" relativeHeight="7">
+                    <wp:anchor behindDoc="0" distT="5715" distB="5080" distL="5080" distR="5715" simplePos="0" locked="0" layoutInCell="1" allowOverlap="1" relativeHeight="5">
                       <wp:simplePos x="0" y="0"/>
                       <wp:positionH relativeFrom="column">
                         <wp:posOffset>1892300</wp:posOffset>
@@ -583,7 +583,7 @@
         </w:trPr>
         <w:tc>
           <w:tcPr>
-            <w:tcW w:w="9480" w:type="dxa"/>
+            <w:tcW w:w="9479" w:type="dxa"/>
             <w:gridSpan w:val="2"/>
             <w:tcBorders>
               <w:top w:val="single" w:sz="4" w:space="0" w:color="000000"/>
@@ -860,7 +860,7 @@
       </w:tblPr>
       <w:tblGrid>
         <w:gridCol w:w="5770"/>
-        <w:gridCol w:w="3728"/>
+        <w:gridCol w:w="3727"/>
       </w:tblGrid>
       <w:tr>
         <w:trPr>
@@ -911,7 +911,7 @@
         </w:tc>
         <w:tc>
           <w:tcPr>
-            <w:tcW w:w="3728" w:type="dxa"/>
+            <w:tcW w:w="3727" w:type="dxa"/>
             <w:tcBorders>
               <w:top w:val="single" w:sz="4" w:space="0" w:color="000000"/>
               <w:left w:val="single" w:sz="4" w:space="0" w:color="000000"/>
@@ -2339,7 +2339,7 @@
         <wp:inline distT="0" distB="0" distL="0" distR="0">
           <wp:extent cx="6053455" cy="733425"/>
           <wp:effectExtent l="0" t="0" r="0" b="0"/>
-          <wp:docPr id="5" name="Imagen 22 Copia 1 Copia 1 Copia 1 Copia 1 Copia 1 Copia 1 Copia 1 Copia 1 Copia 1 Copia 1 Copia 1 Copia 1 Copia 1 Copia 1" descr="cid:image004.jpg@01D74E57.C4EA2700"/>
+          <wp:docPr id="5" name="Imagen 22 Copia 1 Copia 1 Copia 1 Copia 1 Copia 1 Copia 1 Copia 1 Copia 1 Copia 1 Copia 1 Copia 1 Copia 1 Copia 1 Copia 1 Copia 1" descr="cid:image004.jpg@01D74E57.C4EA2700"/>
           <wp:cNvGraphicFramePr>
             <a:graphicFrameLocks xmlns:a="http://schemas.openxmlformats.org/drawingml/2006/main" noChangeAspect="1"/>
           </wp:cNvGraphicFramePr>
@@ -2347,7 +2347,7 @@
             <a:graphicData uri="http://schemas.openxmlformats.org/drawingml/2006/picture">
               <pic:pic xmlns:pic="http://schemas.openxmlformats.org/drawingml/2006/picture">
                 <pic:nvPicPr>
-                  <pic:cNvPr id="5" name="Imagen 22 Copia 1 Copia 1 Copia 1 Copia 1 Copia 1 Copia 1 Copia 1 Copia 1 Copia 1 Copia 1 Copia 1 Copia 1 Copia 1 Copia 1" descr="cid:image004.jpg@01D74E57.C4EA2700"/>
+                  <pic:cNvPr id="5" name="Imagen 22 Copia 1 Copia 1 Copia 1 Copia 1 Copia 1 Copia 1 Copia 1 Copia 1 Copia 1 Copia 1 Copia 1 Copia 1 Copia 1 Copia 1 Copia 1" descr="cid:image004.jpg@01D74E57.C4EA2700"/>
                   <pic:cNvPicPr>
                     <a:picLocks noChangeAspect="1" noChangeArrowheads="1"/>
                   </pic:cNvPicPr>
@@ -2391,7 +2391,7 @@
         <wp:inline distT="0" distB="0" distL="0" distR="0">
           <wp:extent cx="6053455" cy="733425"/>
           <wp:effectExtent l="0" t="0" r="0" b="0"/>
-          <wp:docPr id="6" name="Imagen 23 Copia 1 Copia 1 Copia 1 Copia 1 Copia 1 Copia 1 Copia 1 Copia 1 Copia 1 Copia 1 Copia 1 Copia 1 Copia 1 Copia 1" descr="cid:image004.jpg@01D74E57.C4EA2700"/>
+          <wp:docPr id="6" name="Imagen 23 Copia 1 Copia 1 Copia 1 Copia 1 Copia 1 Copia 1 Copia 1 Copia 1 Copia 1 Copia 1 Copia 1 Copia 1 Copia 1 Copia 1 Copia 1" descr="cid:image004.jpg@01D74E57.C4EA2700"/>
           <wp:cNvGraphicFramePr>
             <a:graphicFrameLocks xmlns:a="http://schemas.openxmlformats.org/drawingml/2006/main" noChangeAspect="1"/>
           </wp:cNvGraphicFramePr>
@@ -2399,7 +2399,7 @@
             <a:graphicData uri="http://schemas.openxmlformats.org/drawingml/2006/picture">
               <pic:pic xmlns:pic="http://schemas.openxmlformats.org/drawingml/2006/picture">
                 <pic:nvPicPr>
-                  <pic:cNvPr id="6" name="Imagen 23 Copia 1 Copia 1 Copia 1 Copia 1 Copia 1 Copia 1 Copia 1 Copia 1 Copia 1 Copia 1 Copia 1 Copia 1 Copia 1 Copia 1" descr="cid:image004.jpg@01D74E57.C4EA2700"/>
+                  <pic:cNvPr id="6" name="Imagen 23 Copia 1 Copia 1 Copia 1 Copia 1 Copia 1 Copia 1 Copia 1 Copia 1 Copia 1 Copia 1 Copia 1 Copia 1 Copia 1 Copia 1 Copia 1" descr="cid:image004.jpg@01D74E57.C4EA2700"/>
                   <pic:cNvPicPr>
                     <a:picLocks noChangeAspect="1" noChangeArrowheads="1"/>
                   </pic:cNvPicPr>
@@ -2453,7 +2453,7 @@
         <wp:inline distT="0" distB="0" distL="0" distR="0">
           <wp:extent cx="3619500" cy="732790"/>
           <wp:effectExtent l="0" t="0" r="0" b="0"/>
-          <wp:docPr id="7" name="Imagen 4 Copia 1 Copia 1 Copia 1 Copia 1 Copia 1 Copia 1 Copia 1 Copia 1 Copia 1 Copia 1 Copia 1 Copia 1 Copia 1 Copia 1" descr="cid:image004.jpg@01D74E57.C4EA2700"/>
+          <wp:docPr id="7" name="Imagen 4 Copia 1 Copia 1 Copia 1 Copia 1 Copia 1 Copia 1 Copia 1 Copia 1 Copia 1 Copia 1 Copia 1 Copia 1 Copia 1 Copia 1 Copia 1" descr="cid:image004.jpg@01D74E57.C4EA2700"/>
           <wp:cNvGraphicFramePr>
             <a:graphicFrameLocks xmlns:a="http://schemas.openxmlformats.org/drawingml/2006/main" noChangeAspect="1"/>
           </wp:cNvGraphicFramePr>
@@ -2461,7 +2461,7 @@
             <a:graphicData uri="http://schemas.openxmlformats.org/drawingml/2006/picture">
               <pic:pic xmlns:pic="http://schemas.openxmlformats.org/drawingml/2006/picture">
                 <pic:nvPicPr>
-                  <pic:cNvPr id="7" name="Imagen 4 Copia 1 Copia 1 Copia 1 Copia 1 Copia 1 Copia 1 Copia 1 Copia 1 Copia 1 Copia 1 Copia 1 Copia 1 Copia 1 Copia 1" descr="cid:image004.jpg@01D74E57.C4EA2700"/>
+                  <pic:cNvPr id="7" name="Imagen 4 Copia 1 Copia 1 Copia 1 Copia 1 Copia 1 Copia 1 Copia 1 Copia 1 Copia 1 Copia 1 Copia 1 Copia 1 Copia 1 Copia 1 Copia 1" descr="cid:image004.jpg@01D74E57.C4EA2700"/>
                   <pic:cNvPicPr>
                     <a:picLocks noChangeAspect="1" noChangeArrowheads="1"/>
                   </pic:cNvPicPr>
@@ -2504,7 +2504,7 @@
         <wp:inline distT="0" distB="0" distL="0" distR="0">
           <wp:extent cx="2434590" cy="733425"/>
           <wp:effectExtent l="0" t="0" r="0" b="0"/>
-          <wp:docPr id="8" name="Imagen 3 Copia 1 Copia 1 Copia 1 Copia 1 Copia 1 Copia 1 Copia 1 Copia 1 Copia 1 Copia 1 Copia 1 Copia 1 Copia 1 Copia 1" descr="cid:image004.jpg@01D74E57.C4EA2700"/>
+          <wp:docPr id="8" name="Imagen 3 Copia 1 Copia 1 Copia 1 Copia 1 Copia 1 Copia 1 Copia 1 Copia 1 Copia 1 Copia 1 Copia 1 Copia 1 Copia 1 Copia 1 Copia 1" descr="cid:image004.jpg@01D74E57.C4EA2700"/>
           <wp:cNvGraphicFramePr>
             <a:graphicFrameLocks xmlns:a="http://schemas.openxmlformats.org/drawingml/2006/main" noChangeAspect="1"/>
           </wp:cNvGraphicFramePr>
@@ -2512,7 +2512,7 @@
             <a:graphicData uri="http://schemas.openxmlformats.org/drawingml/2006/picture">
               <pic:pic xmlns:pic="http://schemas.openxmlformats.org/drawingml/2006/picture">
                 <pic:nvPicPr>
-                  <pic:cNvPr id="8" name="Imagen 3 Copia 1 Copia 1 Copia 1 Copia 1 Copia 1 Copia 1 Copia 1 Copia 1 Copia 1 Copia 1 Copia 1 Copia 1 Copia 1 Copia 1" descr="cid:image004.jpg@01D74E57.C4EA2700"/>
+                  <pic:cNvPr id="8" name="Imagen 3 Copia 1 Copia 1 Copia 1 Copia 1 Copia 1 Copia 1 Copia 1 Copia 1 Copia 1 Copia 1 Copia 1 Copia 1 Copia 1 Copia 1 Copia 1" descr="cid:image004.jpg@01D74E57.C4EA2700"/>
                   <pic:cNvPicPr>
                     <a:picLocks noChangeAspect="1" noChangeArrowheads="1"/>
                   </pic:cNvPicPr>
@@ -2672,6 +2672,7 @@
         </w:tabs>
         <w:ind w:left="0" w:hanging="0"/>
       </w:pPr>
+      <w:rPr/>
     </w:lvl>
     <w:lvl w:ilvl="1">
       <w:start w:val="1"/>
@@ -2685,6 +2686,7 @@
         </w:tabs>
         <w:ind w:left="0" w:hanging="0"/>
       </w:pPr>
+      <w:rPr/>
     </w:lvl>
     <w:lvl w:ilvl="2">
       <w:start w:val="1"/>
@@ -2698,6 +2700,7 @@
         </w:tabs>
         <w:ind w:left="0" w:hanging="0"/>
       </w:pPr>
+      <w:rPr/>
     </w:lvl>
     <w:lvl w:ilvl="3">
       <w:start w:val="1"/>
@@ -2711,6 +2714,7 @@
         </w:tabs>
         <w:ind w:left="0" w:hanging="0"/>
       </w:pPr>
+      <w:rPr/>
     </w:lvl>
     <w:lvl w:ilvl="4">
       <w:start w:val="1"/>
@@ -2724,6 +2728,7 @@
         </w:tabs>
         <w:ind w:left="0" w:hanging="0"/>
       </w:pPr>
+      <w:rPr/>
     </w:lvl>
     <w:lvl w:ilvl="5">
       <w:start w:val="1"/>
@@ -2737,6 +2742,7 @@
         </w:tabs>
         <w:ind w:left="0" w:hanging="0"/>
       </w:pPr>
+      <w:rPr/>
     </w:lvl>
     <w:lvl w:ilvl="6">
       <w:start w:val="1"/>
@@ -2750,6 +2756,7 @@
         </w:tabs>
         <w:ind w:left="0" w:hanging="0"/>
       </w:pPr>
+      <w:rPr/>
     </w:lvl>
     <w:lvl w:ilvl="7">
       <w:start w:val="1"/>
@@ -2763,6 +2770,7 @@
         </w:tabs>
         <w:ind w:left="0" w:hanging="0"/>
       </w:pPr>
+      <w:rPr/>
     </w:lvl>
     <w:lvl w:ilvl="8">
       <w:start w:val="1"/>
@@ -2776,6 +2784,7 @@
         </w:tabs>
         <w:ind w:left="0" w:hanging="0"/>
       </w:pPr>
+      <w:rPr/>
     </w:lvl>
   </w:abstractNum>
   <w:abstractNum w:abstractNumId="2">
@@ -3050,6 +3059,125 @@
       <w:rPr>
         <w:rFonts w:ascii="Wingdings" w:hAnsi="Wingdings" w:cs="Wingdings" w:hint="default"/>
       </w:rPr>
+    </w:lvl>
+  </w:abstractNum>
+  <w:abstractNum w:abstractNumId="4">
+    <w:lvl w:ilvl="0">
+      <w:start w:val="1"/>
+      <w:numFmt w:val="none"/>
+      <w:suff w:val="nothing"/>
+      <w:lvlText w:val=""/>
+      <w:lvlJc w:val="left"/>
+      <w:pPr>
+        <w:tabs>
+          <w:tab w:val="num" w:pos="0"/>
+        </w:tabs>
+        <w:ind w:left="0" w:hanging="0"/>
+      </w:pPr>
+    </w:lvl>
+    <w:lvl w:ilvl="1">
+      <w:start w:val="1"/>
+      <w:numFmt w:val="none"/>
+      <w:suff w:val="nothing"/>
+      <w:lvlText w:val=""/>
+      <w:lvlJc w:val="left"/>
+      <w:pPr>
+        <w:tabs>
+          <w:tab w:val="num" w:pos="0"/>
+        </w:tabs>
+        <w:ind w:left="0" w:hanging="0"/>
+      </w:pPr>
+    </w:lvl>
+    <w:lvl w:ilvl="2">
+      <w:start w:val="1"/>
+      <w:numFmt w:val="none"/>
+      <w:suff w:val="nothing"/>
+      <w:lvlText w:val=""/>
+      <w:lvlJc w:val="left"/>
+      <w:pPr>
+        <w:tabs>
+          <w:tab w:val="num" w:pos="0"/>
+        </w:tabs>
+        <w:ind w:left="0" w:hanging="0"/>
+      </w:pPr>
+    </w:lvl>
+    <w:lvl w:ilvl="3">
+      <w:start w:val="1"/>
+      <w:numFmt w:val="none"/>
+      <w:suff w:val="nothing"/>
+      <w:lvlText w:val=""/>
+      <w:lvlJc w:val="left"/>
+      <w:pPr>
+        <w:tabs>
+          <w:tab w:val="num" w:pos="0"/>
+        </w:tabs>
+        <w:ind w:left="0" w:hanging="0"/>
+      </w:pPr>
+    </w:lvl>
+    <w:lvl w:ilvl="4">
+      <w:start w:val="1"/>
+      <w:numFmt w:val="none"/>
+      <w:suff w:val="nothing"/>
+      <w:lvlText w:val=""/>
+      <w:lvlJc w:val="left"/>
+      <w:pPr>
+        <w:tabs>
+          <w:tab w:val="num" w:pos="0"/>
+        </w:tabs>
+        <w:ind w:left="0" w:hanging="0"/>
+      </w:pPr>
+    </w:lvl>
+    <w:lvl w:ilvl="5">
+      <w:start w:val="1"/>
+      <w:numFmt w:val="none"/>
+      <w:suff w:val="nothing"/>
+      <w:lvlText w:val=""/>
+      <w:lvlJc w:val="left"/>
+      <w:pPr>
+        <w:tabs>
+          <w:tab w:val="num" w:pos="0"/>
+        </w:tabs>
+        <w:ind w:left="0" w:hanging="0"/>
+      </w:pPr>
+    </w:lvl>
+    <w:lvl w:ilvl="6">
+      <w:start w:val="1"/>
+      <w:numFmt w:val="none"/>
+      <w:suff w:val="nothing"/>
+      <w:lvlText w:val=""/>
+      <w:lvlJc w:val="left"/>
+      <w:pPr>
+        <w:tabs>
+          <w:tab w:val="num" w:pos="0"/>
+        </w:tabs>
+        <w:ind w:left="0" w:hanging="0"/>
+      </w:pPr>
+    </w:lvl>
+    <w:lvl w:ilvl="7">
+      <w:start w:val="1"/>
+      <w:numFmt w:val="none"/>
+      <w:suff w:val="nothing"/>
+      <w:lvlText w:val=""/>
+      <w:lvlJc w:val="left"/>
+      <w:pPr>
+        <w:tabs>
+          <w:tab w:val="num" w:pos="0"/>
+        </w:tabs>
+        <w:ind w:left="0" w:hanging="0"/>
+      </w:pPr>
+    </w:lvl>
+    <w:lvl w:ilvl="8">
+      <w:start w:val="1"/>
+      <w:numFmt w:val="none"/>
+      <w:suff w:val="nothing"/>
+      <w:lvlText w:val=""/>
+      <w:lvlJc w:val="left"/>
+      <w:pPr>
+        <w:tabs>
+          <w:tab w:val="num" w:pos="0"/>
+        </w:tabs>
+        <w:ind w:left="0" w:hanging="0"/>
+      </w:pPr>
     </w:lvl>
   </w:abstractNum>
   <w:num w:numId="1">
@@ -3061,6 +3189,9 @@
   <w:num w:numId="3">
     <w:abstractNumId w:val="3"/>
   </w:num>
+  <w:num w:numId="4">
+    <w:abstractNumId w:val="4"/>
+  </w:num>
 </w:numbering>
 </file>
 
@@ -3085,9 +3216,7 @@
     <w:pPr>
       <w:widowControl/>
       <w:suppressAutoHyphens w:val="true"/>
-      <w:kinsoku w:val="true"/>
-      <w:overflowPunct w:val="false"/>
-      <w:autoSpaceDE w:val="true"/>
+      <w:overflowPunct w:val="true"/>
       <w:bidi w:val="0"/>
       <w:spacing w:before="0" w:after="240"/>
       <w:jc w:val="left"/>
@@ -3821,9 +3950,7 @@
     <w:pPr>
       <w:widowControl/>
       <w:suppressAutoHyphens w:val="true"/>
-      <w:kinsoku w:val="true"/>
-      <w:overflowPunct w:val="false"/>
-      <w:autoSpaceDE w:val="true"/>
+      <w:overflowPunct w:val="true"/>
       <w:bidi w:val="0"/>
       <w:spacing w:before="0" w:after="0"/>
       <w:jc w:val="left"/>
@@ -3865,7 +3992,7 @@
     <w:name w:val="Body Text Indent"/>
     <w:basedOn w:val="BodyText"/>
     <w:pPr>
-      <w:overflowPunct w:val="true"/>
+      <w:overflowPunct w:val="false"/>
       <w:spacing w:lineRule="atLeast" w:line="240" w:before="0" w:after="240"/>
       <w:ind w:firstLine="360" w:left="360"/>
       <w:jc w:val="both"/>
@@ -3881,7 +4008,7 @@
     <w:basedOn w:val="Normal"/>
     <w:qFormat/>
     <w:pPr>
-      <w:overflowPunct w:val="true"/>
+      <w:overflowPunct w:val="false"/>
       <w:spacing w:before="60" w:after="60"/>
       <w:textAlignment w:val="auto"/>
     </w:pPr>
@@ -3952,7 +4079,7 @@
     <w:basedOn w:val="BodyText"/>
     <w:qFormat/>
     <w:pPr>
-      <w:overflowPunct w:val="true"/>
+      <w:overflowPunct w:val="false"/>
       <w:spacing w:lineRule="auto" w:line="360" w:before="120" w:after="120"/>
       <w:jc w:val="both"/>
       <w:textAlignment w:val="auto"/>
@@ -3968,7 +4095,7 @@
     <w:basedOn w:val="Normal"/>
     <w:qFormat/>
     <w:pPr>
-      <w:overflowPunct w:val="true"/>
+      <w:overflowPunct w:val="false"/>
       <w:spacing w:lineRule="auto" w:line="276" w:before="0" w:after="0"/>
       <w:ind w:left="720"/>
       <w:contextualSpacing/>
@@ -4008,9 +4135,7 @@
     <w:pPr>
       <w:widowControl/>
       <w:suppressAutoHyphens w:val="true"/>
-      <w:kinsoku w:val="true"/>
-      <w:overflowPunct w:val="true"/>
-      <w:autoSpaceDE w:val="true"/>
+      <w:overflowPunct w:val="false"/>
       <w:bidi w:val="0"/>
       <w:spacing w:before="0" w:after="0"/>
       <w:jc w:val="left"/>

</xml_diff>